<commit_message>
feat: add demographic cohort calibration, separate personal analysis, and clean consumer watch UI typography
</commit_message>
<xml_diff>
--- a/InstaHealth_Mini_Project_Report.docx
+++ b/InstaHealth_Mini_Project_Report.docx
@@ -7543,7 +7543,7 @@
                 <w:i w:val="0"/>
                 <w:sz w:val="19"/>
               </w:rPr>
-              <w:t>Gulati et al. [5], 2010</w:t>
+              <w:t>Tanaka et al. [4], 2001</w:t>
             </w:r>
           </w:p>
         </w:tc>
@@ -7563,7 +7563,7 @@
                 <w:i w:val="0"/>
                 <w:sz w:val="19"/>
               </w:rPr>
-              <w:t>St. James Women Take Heart Project</w:t>
+              <w:t>Meta-Analysis of Maximum Heart Rate</w:t>
             </w:r>
           </w:p>
         </w:tc>
@@ -7583,7 +7583,7 @@
                 <w:i w:val="0"/>
                 <w:sz w:val="19"/>
               </w:rPr>
-              <w:t>5,437 Asymptomatic Females</w:t>
+              <w:t>351 Studies (18,712 subjects)</w:t>
             </w:r>
           </w:p>
         </w:tc>
@@ -7603,7 +7603,7 @@
                 <w:i w:val="0"/>
                 <w:sz w:val="19"/>
               </w:rPr>
-              <w:t>Discovered sex-differentiated female heart rate degradation: 206 - 0.88 * age.</w:t>
+              <w:t>Validated formula HRmax = 208 - 0.7 * age across adult populations.</w:t>
             </w:r>
           </w:p>
         </w:tc>
@@ -7623,7 +7623,7 @@
                 <w:i w:val="0"/>
                 <w:sz w:val="19"/>
               </w:rPr>
-              <w:t>Focused strictly on clinical stress testing rather than autonomous wearable integration.</w:t>
+              <w:t>Predominantly male-heavy demographic distributions; +/-10 bpm individual variation.</w:t>
             </w:r>
           </w:p>
         </w:tc>
@@ -7665,7 +7665,7 @@
                 <w:i w:val="0"/>
                 <w:sz w:val="19"/>
               </w:rPr>
-              <w:t>Tanaka et al. [4], 2001</w:t>
+              <w:t>Gulati et al. [5], 2010</w:t>
             </w:r>
           </w:p>
         </w:tc>
@@ -7685,7 +7685,7 @@
                 <w:i w:val="0"/>
                 <w:sz w:val="19"/>
               </w:rPr>
-              <w:t>Meta-Analysis of Maximum Heart Rate</w:t>
+              <w:t>St. James Women Take Heart Project</w:t>
             </w:r>
           </w:p>
         </w:tc>
@@ -7705,7 +7705,7 @@
                 <w:i w:val="0"/>
                 <w:sz w:val="19"/>
               </w:rPr>
-              <w:t>351 Studies (18,712 subjects)</w:t>
+              <w:t>5,437 Asymptomatic Females</w:t>
             </w:r>
           </w:p>
         </w:tc>
@@ -7725,7 +7725,7 @@
                 <w:i w:val="0"/>
                 <w:sz w:val="19"/>
               </w:rPr>
-              <w:t>Validated formula HRmax = 208 - 0.7 * age across broad adult populations.</w:t>
+              <w:t>Discovered sex-differentiated female heart rate degradation: 206 - 0.88 * age.</w:t>
             </w:r>
           </w:p>
         </w:tc>
@@ -7745,7 +7745,7 @@
                 <w:i w:val="0"/>
                 <w:sz w:val="19"/>
               </w:rPr>
-              <w:t>Standard formulation neglects resting cardiovascular reserve (HRR) dynamics.</w:t>
+              <w:t>Focused strictly on female stress testing; less accurate above age 60 or for athletes.</w:t>
             </w:r>
           </w:p>
         </w:tc>
@@ -7867,7 +7867,7 @@
                 <w:i w:val="0"/>
                 <w:sz w:val="19"/>
               </w:rPr>
-              <w:t>Requires continuous calibration of resting heart rate under relaxed conditions.</w:t>
+              <w:t>Requires continuous calibration of resting heart rate under relaxed nocturnal conditions.</w:t>
             </w:r>
           </w:p>
         </w:tc>
@@ -7909,7 +7909,7 @@
                 <w:i w:val="0"/>
                 <w:sz w:val="19"/>
               </w:rPr>
-              <w:t>Apple &amp; Google [7, 8], 2023</w:t>
+              <w:t>Ekelund et al. [7], 2019</w:t>
             </w:r>
           </w:p>
         </w:tc>
@@ -7929,7 +7929,7 @@
                 <w:i w:val="0"/>
                 <w:sz w:val="19"/>
               </w:rPr>
-              <w:t>Wearable Developer Platforms</w:t>
+              <w:t>Harmonised Sedentary Meta-Analysis</w:t>
             </w:r>
           </w:p>
         </w:tc>
@@ -7949,7 +7949,7 @@
                 <w:i w:val="0"/>
                 <w:sz w:val="19"/>
               </w:rPr>
-              <w:t>watchOS &amp; Wear OS SDKs</w:t>
+              <w:t>36,383 Adults (BMJ / Lancet)</w:t>
             </w:r>
           </w:p>
         </w:tc>
@@ -7969,7 +7969,7 @@
                 <w:i w:val="0"/>
                 <w:sz w:val="19"/>
               </w:rPr>
-              <w:t>Provided local hardware APIs, WebKit sandboxes, and hardware sensors.</w:t>
+              <w:t>Demonstrated dose-response between sedentary volume and all-cause mortality.</w:t>
             </w:r>
           </w:p>
         </w:tc>
@@ -7989,7 +7989,7 @@
                 <w:i w:val="0"/>
                 <w:sz w:val="19"/>
               </w:rPr>
-              <w:t>Default templates encourage heavy cloud synchronization and Firebase integration.</w:t>
+              <w:t>Evidence concerns total daily volume rather than an inflexible 60-minute cutoff.</w:t>
             </w:r>
           </w:p>
         </w:tc>
@@ -8031,7 +8031,7 @@
                 <w:i w:val="0"/>
                 <w:sz w:val="19"/>
               </w:rPr>
-              <w:t>Zuboff [9], 2019</w:t>
+              <w:t>Saint-Maurice et al. [8], 2020</w:t>
             </w:r>
           </w:p>
         </w:tc>
@@ -8051,7 +8051,7 @@
                 <w:i w:val="0"/>
                 <w:sz w:val="19"/>
               </w:rPr>
-              <w:t>Surveillance Capitalism Analysis</w:t>
+              <w:t>Daily Step Count &amp; Mortality</w:t>
             </w:r>
           </w:p>
         </w:tc>
@@ -8071,7 +8071,7 @@
                 <w:i w:val="0"/>
                 <w:sz w:val="19"/>
               </w:rPr>
-              <w:t>Commercial IoT Ecosystems</w:t>
+              <w:t>NHANES Cohort (N=4,840)</w:t>
             </w:r>
           </w:p>
         </w:tc>
@@ -8091,7 +8091,7 @@
                 <w:i w:val="0"/>
                 <w:sz w:val="19"/>
               </w:rPr>
-              <w:t>Highlighted pervasive behavioral data exfiltration by consumer smart devices.</w:t>
+              <w:t>8,000-10,000 steps/day associated with 50-65% lower mortality.</w:t>
             </w:r>
           </w:p>
         </w:tc>
@@ -8111,7 +8111,251 @@
                 <w:i w:val="0"/>
                 <w:sz w:val="19"/>
               </w:rPr>
-              <w:t>Sociological critique without proposing technical edge-computing software solutions.</w:t>
+              <w:t>Step targets require progressive adaptation to baseline physical condition.</w:t>
+            </w:r>
+          </w:p>
+        </w:tc>
+      </w:tr>
+      <w:tr>
+        <w:tc>
+          <w:tcPr>
+            <w:tcW w:type="dxa" w:w="700"/>
+          </w:tcPr>
+          <w:p>
+            <w:pPr>
+              <w:spacing w:before="40" w:after="40" w:line="240" w:lineRule="auto"/>
+              <w:jc w:val="left"/>
+            </w:pPr>
+            <w:r>
+              <w:rPr>
+                <w:rFonts w:ascii="Times New Roman" w:hAnsi="Times New Roman"/>
+                <w:b/>
+                <w:i w:val="0"/>
+                <w:sz w:val="19"/>
+              </w:rPr>
+              <w:t>9</w:t>
+            </w:r>
+          </w:p>
+        </w:tc>
+        <w:tc>
+          <w:tcPr>
+            <w:tcW w:type="dxa" w:w="1400"/>
+          </w:tcPr>
+          <w:p>
+            <w:pPr>
+              <w:spacing w:before="40" w:after="40" w:line="240" w:lineRule="auto"/>
+              <w:jc w:val="left"/>
+            </w:pPr>
+            <w:r>
+              <w:rPr>
+                <w:rFonts w:ascii="Times New Roman" w:hAnsi="Times New Roman"/>
+                <w:b w:val="0"/>
+                <w:i w:val="0"/>
+                <w:sz w:val="19"/>
+              </w:rPr>
+              <w:t>Apple &amp; Google [9, 10], 2023</w:t>
+            </w:r>
+          </w:p>
+        </w:tc>
+        <w:tc>
+          <w:tcPr>
+            <w:tcW w:type="dxa" w:w="1600"/>
+          </w:tcPr>
+          <w:p>
+            <w:pPr>
+              <w:spacing w:before="40" w:after="40" w:line="240" w:lineRule="auto"/>
+              <w:jc w:val="left"/>
+            </w:pPr>
+            <w:r>
+              <w:rPr>
+                <w:rFonts w:ascii="Times New Roman" w:hAnsi="Times New Roman"/>
+                <w:b w:val="0"/>
+                <w:i w:val="0"/>
+                <w:sz w:val="19"/>
+              </w:rPr>
+              <w:t>Wearable Developer Platforms</w:t>
+            </w:r>
+          </w:p>
+        </w:tc>
+        <w:tc>
+          <w:tcPr>
+            <w:tcW w:type="dxa" w:w="1200"/>
+          </w:tcPr>
+          <w:p>
+            <w:pPr>
+              <w:spacing w:before="40" w:after="40" w:line="240" w:lineRule="auto"/>
+              <w:jc w:val="left"/>
+            </w:pPr>
+            <w:r>
+              <w:rPr>
+                <w:rFonts w:ascii="Times New Roman" w:hAnsi="Times New Roman"/>
+                <w:b w:val="0"/>
+                <w:i w:val="0"/>
+                <w:sz w:val="19"/>
+              </w:rPr>
+              <w:t>watchOS &amp; Wear OS SDKs</w:t>
+            </w:r>
+          </w:p>
+        </w:tc>
+        <w:tc>
+          <w:tcPr>
+            <w:tcW w:type="dxa" w:w="1700"/>
+          </w:tcPr>
+          <w:p>
+            <w:pPr>
+              <w:spacing w:before="40" w:after="40" w:line="240" w:lineRule="auto"/>
+              <w:jc w:val="left"/>
+            </w:pPr>
+            <w:r>
+              <w:rPr>
+                <w:rFonts w:ascii="Times New Roman" w:hAnsi="Times New Roman"/>
+                <w:b w:val="0"/>
+                <w:i w:val="0"/>
+                <w:sz w:val="19"/>
+              </w:rPr>
+              <w:t>Provided local hardware APIs, WebKit sandboxes, and hardware sensors.</w:t>
+            </w:r>
+          </w:p>
+        </w:tc>
+        <w:tc>
+          <w:tcPr>
+            <w:tcW w:type="dxa" w:w="1706"/>
+          </w:tcPr>
+          <w:p>
+            <w:pPr>
+              <w:spacing w:before="40" w:after="40" w:line="240" w:lineRule="auto"/>
+              <w:jc w:val="left"/>
+            </w:pPr>
+            <w:r>
+              <w:rPr>
+                <w:rFonts w:ascii="Times New Roman" w:hAnsi="Times New Roman"/>
+                <w:b w:val="0"/>
+                <w:i w:val="0"/>
+                <w:sz w:val="19"/>
+              </w:rPr>
+              <w:t>Default templates encourage heavy cloud synchronization and centralized telemetry.</w:t>
+            </w:r>
+          </w:p>
+        </w:tc>
+      </w:tr>
+      <w:tr>
+        <w:tc>
+          <w:tcPr>
+            <w:tcW w:type="dxa" w:w="700"/>
+          </w:tcPr>
+          <w:p>
+            <w:pPr>
+              <w:spacing w:before="40" w:after="40" w:line="240" w:lineRule="auto"/>
+              <w:jc w:val="left"/>
+            </w:pPr>
+            <w:r>
+              <w:rPr>
+                <w:rFonts w:ascii="Times New Roman" w:hAnsi="Times New Roman"/>
+                <w:b/>
+                <w:i w:val="0"/>
+                <w:sz w:val="19"/>
+              </w:rPr>
+              <w:t>10</w:t>
+            </w:r>
+          </w:p>
+        </w:tc>
+        <w:tc>
+          <w:tcPr>
+            <w:tcW w:type="dxa" w:w="1400"/>
+          </w:tcPr>
+          <w:p>
+            <w:pPr>
+              <w:spacing w:before="40" w:after="40" w:line="240" w:lineRule="auto"/>
+              <w:jc w:val="left"/>
+            </w:pPr>
+            <w:r>
+              <w:rPr>
+                <w:rFonts w:ascii="Times New Roman" w:hAnsi="Times New Roman"/>
+                <w:b w:val="0"/>
+                <w:i w:val="0"/>
+                <w:sz w:val="19"/>
+              </w:rPr>
+              <w:t>Al-Turjman [11], 2020</w:t>
+            </w:r>
+          </w:p>
+        </w:tc>
+        <w:tc>
+          <w:tcPr>
+            <w:tcW w:type="dxa" w:w="1600"/>
+          </w:tcPr>
+          <w:p>
+            <w:pPr>
+              <w:spacing w:before="40" w:after="40" w:line="240" w:lineRule="auto"/>
+              <w:jc w:val="left"/>
+            </w:pPr>
+            <w:r>
+              <w:rPr>
+                <w:rFonts w:ascii="Times New Roman" w:hAnsi="Times New Roman"/>
+                <w:b w:val="0"/>
+                <w:i w:val="0"/>
+                <w:sz w:val="19"/>
+              </w:rPr>
+              <w:t>Edge Computing in Wearable IoT</w:t>
+            </w:r>
+          </w:p>
+        </w:tc>
+        <w:tc>
+          <w:tcPr>
+            <w:tcW w:type="dxa" w:w="1200"/>
+          </w:tcPr>
+          <w:p>
+            <w:pPr>
+              <w:spacing w:before="40" w:after="40" w:line="240" w:lineRule="auto"/>
+              <w:jc w:val="left"/>
+            </w:pPr>
+            <w:r>
+              <w:rPr>
+                <w:rFonts w:ascii="Times New Roman" w:hAnsi="Times New Roman"/>
+                <w:b w:val="0"/>
+                <w:i w:val="0"/>
+                <w:sz w:val="19"/>
+              </w:rPr>
+              <w:t>Wearable IoT Ecosystems</w:t>
+            </w:r>
+          </w:p>
+        </w:tc>
+        <w:tc>
+          <w:tcPr>
+            <w:tcW w:type="dxa" w:w="1700"/>
+          </w:tcPr>
+          <w:p>
+            <w:pPr>
+              <w:spacing w:before="40" w:after="40" w:line="240" w:lineRule="auto"/>
+              <w:jc w:val="left"/>
+            </w:pPr>
+            <w:r>
+              <w:rPr>
+                <w:rFonts w:ascii="Times New Roman" w:hAnsi="Times New Roman"/>
+                <w:b w:val="0"/>
+                <w:i w:val="0"/>
+                <w:sz w:val="19"/>
+              </w:rPr>
+              <w:t>Highlighted that on-device processing eliminates wireless transmission energy.</w:t>
+            </w:r>
+          </w:p>
+        </w:tc>
+        <w:tc>
+          <w:tcPr>
+            <w:tcW w:type="dxa" w:w="1706"/>
+          </w:tcPr>
+          <w:p>
+            <w:pPr>
+              <w:spacing w:before="40" w:after="40" w:line="240" w:lineRule="auto"/>
+              <w:jc w:val="left"/>
+            </w:pPr>
+            <w:r>
+              <w:rPr>
+                <w:rFonts w:ascii="Times New Roman" w:hAnsi="Times New Roman"/>
+                <w:b w:val="0"/>
+                <w:i w:val="0"/>
+                <w:sz w:val="19"/>
+              </w:rPr>
+              <w:t>Focuses on theoretical architectures without open-source physiological integration.</w:t>
             </w:r>
           </w:p>
         </w:tc>
@@ -10227,7 +10471,7 @@
                 <w:i w:val="0"/>
                 <w:sz w:val="19"/>
               </w:rPr>
-              <w:t>Day 1-2 Human Benchmarking</w:t>
+              <w:t>Observed Peak HR Overwrite</w:t>
             </w:r>
           </w:p>
         </w:tc>
@@ -10247,7 +10491,7 @@
                 <w:i w:val="0"/>
                 <w:sz w:val="19"/>
               </w:rPr>
-              <w:t>Day 1 Telemetry (7.2h sleep, 58 bpm)</w:t>
+              <w:t>Record hard effort (192 bpm) for 30y female</w:t>
             </w:r>
           </w:p>
         </w:tc>
@@ -10267,7 +10511,7 @@
                 <w:i w:val="0"/>
                 <w:sz w:val="19"/>
               </w:rPr>
-              <w:t>Display demographic comparison; calibration banner active</w:t>
+              <w:t>Max HR overrides formula (180 -&gt; 192 bpm)</w:t>
             </w:r>
           </w:p>
         </w:tc>
@@ -10287,7 +10531,7 @@
                 <w:i w:val="0"/>
                 <w:sz w:val="19"/>
               </w:rPr>
-              <w:t>Side-by-side grid rendered; calibration active</w:t>
+              <w:t>Max HR calculated as 192 bpm</w:t>
             </w:r>
           </w:p>
         </w:tc>
@@ -10349,7 +10593,7 @@
                 <w:i w:val="0"/>
                 <w:sz w:val="19"/>
               </w:rPr>
-              <w:t>Day 3 Auto-Close Trigger</w:t>
+              <w:t>Minimum Wear-Time Guardrail</w:t>
             </w:r>
           </w:p>
         </w:tc>
@@ -10369,7 +10613,7 @@
                 <w:i w:val="0"/>
                 <w:sz w:val="19"/>
               </w:rPr>
-              <w:t>Advance to Day 3</w:t>
+              <w:t>Advance day with wear time = 6 hours</w:t>
             </w:r>
           </w:p>
         </w:tc>
@@ -10389,7 +10633,7 @@
                 <w:i w:val="0"/>
                 <w:sz w:val="19"/>
               </w:rPr>
-              <w:t>Calibration card automatically removed; prescriptions active</w:t>
+              <w:t>System rejects calibration progression (&lt;16h)</w:t>
             </w:r>
           </w:p>
         </w:tc>
@@ -10409,7 +10653,7 @@
                 <w:i w:val="0"/>
                 <w:sz w:val="19"/>
               </w:rPr>
-              <w:t>Card closed automatically; targets unlocked</w:t>
+              <w:t>Warning emitted; Day progression held</w:t>
             </w:r>
           </w:p>
         </w:tc>
@@ -10471,7 +10715,7 @@
                 <w:i w:val="0"/>
                 <w:sz w:val="19"/>
               </w:rPr>
-              <w:t>Smartwatch Typography</w:t>
+              <w:t>Profile Recalibration Reset</w:t>
             </w:r>
           </w:p>
         </w:tc>
@@ -10491,7 +10735,7 @@
                 <w:i w:val="0"/>
                 <w:sz w:val="19"/>
               </w:rPr>
-              <w:t>DOM Font Size Inspection</w:t>
+              <w:t>Trigger resetProfile() on calibrated user</w:t>
             </w:r>
           </w:p>
         </w:tc>
@@ -10511,7 +10755,7 @@
                 <w:i w:val="0"/>
                 <w:sz w:val="19"/>
               </w:rPr>
-              <w:t>All fonts strictly &gt;= 11 px (0 instances &lt; 11 px)</w:t>
+              <w:t>Timeline resets to Day 1, demographics retained</w:t>
             </w:r>
           </w:p>
         </w:tc>
@@ -10531,7 +10775,251 @@
                 <w:i w:val="0"/>
                 <w:sz w:val="19"/>
               </w:rPr>
-              <w:t>Minimum font size = 11 px; 0 violations</w:t>
+              <w:t>Day 1 active; 0 samples; baseline cleared</w:t>
+            </w:r>
+          </w:p>
+        </w:tc>
+        <w:tc>
+          <w:tcPr>
+            <w:tcW w:type="dxa" w:w="1106"/>
+          </w:tcPr>
+          <w:p>
+            <w:pPr>
+              <w:spacing w:before="40" w:after="40" w:line="240" w:lineRule="auto"/>
+              <w:jc w:val="left"/>
+            </w:pPr>
+            <w:r>
+              <w:rPr>
+                <w:rFonts w:ascii="Times New Roman" w:hAnsi="Times New Roman"/>
+                <w:b/>
+                <w:i w:val="0"/>
+                <w:sz w:val="19"/>
+              </w:rPr>
+              <w:t>Pass</w:t>
+            </w:r>
+          </w:p>
+        </w:tc>
+      </w:tr>
+      <w:tr>
+        <w:tc>
+          <w:tcPr>
+            <w:tcW w:type="dxa" w:w="800"/>
+          </w:tcPr>
+          <w:p>
+            <w:pPr>
+              <w:spacing w:before="40" w:after="40" w:line="240" w:lineRule="auto"/>
+              <w:jc w:val="left"/>
+            </w:pPr>
+            <w:r>
+              <w:rPr>
+                <w:rFonts w:ascii="Times New Roman" w:hAnsi="Times New Roman"/>
+                <w:b/>
+                <w:i w:val="0"/>
+                <w:sz w:val="19"/>
+              </w:rPr>
+              <w:t>TC07</w:t>
+            </w:r>
+          </w:p>
+        </w:tc>
+        <w:tc>
+          <w:tcPr>
+            <w:tcW w:type="dxa" w:w="1900"/>
+          </w:tcPr>
+          <w:p>
+            <w:pPr>
+              <w:spacing w:before="40" w:after="40" w:line="240" w:lineRule="auto"/>
+              <w:jc w:val="left"/>
+            </w:pPr>
+            <w:r>
+              <w:rPr>
+                <w:rFonts w:ascii="Times New Roman" w:hAnsi="Times New Roman"/>
+                <w:b w:val="0"/>
+                <w:i w:val="0"/>
+                <w:sz w:val="19"/>
+              </w:rPr>
+              <w:t>Micro-SGD Guardrails &amp; Disclaimers</w:t>
+            </w:r>
+          </w:p>
+        </w:tc>
+        <w:tc>
+          <w:tcPr>
+            <w:tcW w:type="dxa" w:w="1300"/>
+          </w:tcPr>
+          <w:p>
+            <w:pPr>
+              <w:spacing w:before="40" w:after="40" w:line="240" w:lineRule="auto"/>
+              <w:jc w:val="left"/>
+            </w:pPr>
+            <w:r>
+              <w:rPr>
+                <w:rFonts w:ascii="Times New Roman" w:hAnsi="Times New Roman"/>
+                <w:b w:val="0"/>
+                <w:i w:val="0"/>
+                <w:sz w:val="19"/>
+              </w:rPr>
+              <w:t>Update weights with lr=0.01 and max_delta=0.05</w:t>
+            </w:r>
+          </w:p>
+        </w:tc>
+        <w:tc>
+          <w:tcPr>
+            <w:tcW w:type="dxa" w:w="1600"/>
+          </w:tcPr>
+          <w:p>
+            <w:pPr>
+              <w:spacing w:before="40" w:after="40" w:line="240" w:lineRule="auto"/>
+              <w:jc w:val="left"/>
+            </w:pPr>
+            <w:r>
+              <w:rPr>
+                <w:rFonts w:ascii="Times New Roman" w:hAnsi="Times New Roman"/>
+                <w:b w:val="0"/>
+                <w:i w:val="0"/>
+                <w:sz w:val="19"/>
+              </w:rPr>
+              <w:t>Weights clipped; rollback verified; disclaimer present</w:t>
+            </w:r>
+          </w:p>
+        </w:tc>
+        <w:tc>
+          <w:tcPr>
+            <w:tcW w:type="dxa" w:w="1600"/>
+          </w:tcPr>
+          <w:p>
+            <w:pPr>
+              <w:spacing w:before="40" w:after="40" w:line="240" w:lineRule="auto"/>
+              <w:jc w:val="left"/>
+            </w:pPr>
+            <w:r>
+              <w:rPr>
+                <w:rFonts w:ascii="Times New Roman" w:hAnsi="Times New Roman"/>
+                <w:b w:val="0"/>
+                <w:i w:val="0"/>
+                <w:sz w:val="19"/>
+              </w:rPr>
+              <w:t>W3/b3 bounded; FDA/CDSCO disclaimer verified</w:t>
+            </w:r>
+          </w:p>
+        </w:tc>
+        <w:tc>
+          <w:tcPr>
+            <w:tcW w:type="dxa" w:w="1106"/>
+          </w:tcPr>
+          <w:p>
+            <w:pPr>
+              <w:spacing w:before="40" w:after="40" w:line="240" w:lineRule="auto"/>
+              <w:jc w:val="left"/>
+            </w:pPr>
+            <w:r>
+              <w:rPr>
+                <w:rFonts w:ascii="Times New Roman" w:hAnsi="Times New Roman"/>
+                <w:b/>
+                <w:i w:val="0"/>
+                <w:sz w:val="19"/>
+              </w:rPr>
+              <w:t>Pass</w:t>
+            </w:r>
+          </w:p>
+        </w:tc>
+      </w:tr>
+      <w:tr>
+        <w:tc>
+          <w:tcPr>
+            <w:tcW w:type="dxa" w:w="800"/>
+          </w:tcPr>
+          <w:p>
+            <w:pPr>
+              <w:spacing w:before="40" w:after="40" w:line="240" w:lineRule="auto"/>
+              <w:jc w:val="left"/>
+            </w:pPr>
+            <w:r>
+              <w:rPr>
+                <w:rFonts w:ascii="Times New Roman" w:hAnsi="Times New Roman"/>
+                <w:b/>
+                <w:i w:val="0"/>
+                <w:sz w:val="19"/>
+              </w:rPr>
+              <w:t>TC08</w:t>
+            </w:r>
+          </w:p>
+        </w:tc>
+        <w:tc>
+          <w:tcPr>
+            <w:tcW w:type="dxa" w:w="1900"/>
+          </w:tcPr>
+          <w:p>
+            <w:pPr>
+              <w:spacing w:before="40" w:after="40" w:line="240" w:lineRule="auto"/>
+              <w:jc w:val="left"/>
+            </w:pPr>
+            <w:r>
+              <w:rPr>
+                <w:rFonts w:ascii="Times New Roman" w:hAnsi="Times New Roman"/>
+                <w:b w:val="0"/>
+                <w:i w:val="0"/>
+                <w:sz w:val="19"/>
+              </w:rPr>
+              <w:t>Day 3 Auto-Close Trigger</w:t>
+            </w:r>
+          </w:p>
+        </w:tc>
+        <w:tc>
+          <w:tcPr>
+            <w:tcW w:type="dxa" w:w="1300"/>
+          </w:tcPr>
+          <w:p>
+            <w:pPr>
+              <w:spacing w:before="40" w:after="40" w:line="240" w:lineRule="auto"/>
+              <w:jc w:val="left"/>
+            </w:pPr>
+            <w:r>
+              <w:rPr>
+                <w:rFonts w:ascii="Times New Roman" w:hAnsi="Times New Roman"/>
+                <w:b w:val="0"/>
+                <w:i w:val="0"/>
+                <w:sz w:val="19"/>
+              </w:rPr>
+              <w:t>Advance to Day 3 with valid wear (&gt;=16h)</w:t>
+            </w:r>
+          </w:p>
+        </w:tc>
+        <w:tc>
+          <w:tcPr>
+            <w:tcW w:type="dxa" w:w="1600"/>
+          </w:tcPr>
+          <w:p>
+            <w:pPr>
+              <w:spacing w:before="40" w:after="40" w:line="240" w:lineRule="auto"/>
+              <w:jc w:val="left"/>
+            </w:pPr>
+            <w:r>
+              <w:rPr>
+                <w:rFonts w:ascii="Times New Roman" w:hAnsi="Times New Roman"/>
+                <w:b w:val="0"/>
+                <w:i w:val="0"/>
+                <w:sz w:val="19"/>
+              </w:rPr>
+              <w:t>Calibration card automatically removed; prescriptions active</w:t>
+            </w:r>
+          </w:p>
+        </w:tc>
+        <w:tc>
+          <w:tcPr>
+            <w:tcW w:type="dxa" w:w="1600"/>
+          </w:tcPr>
+          <w:p>
+            <w:pPr>
+              <w:spacing w:before="40" w:after="40" w:line="240" w:lineRule="auto"/>
+              <w:jc w:val="left"/>
+            </w:pPr>
+            <w:r>
+              <w:rPr>
+                <w:rFonts w:ascii="Times New Roman" w:hAnsi="Times New Roman"/>
+                <w:b w:val="0"/>
+                <w:i w:val="0"/>
+                <w:sz w:val="19"/>
+              </w:rPr>
+              <w:t>Card closed automatically; targets unlocked</w:t>
             </w:r>
           </w:p>
         </w:tc>
@@ -10693,6 +11181,306 @@
         </w:rPr>
         <w:lastRenderedPageBreak/>
         <w:t>REFERENCES</w:t>
+      </w:r>
+    </w:p>
+    <w:p>
+      <w:pPr>
+        <w:spacing w:after="80" w:line="360" w:lineRule="auto"/>
+        <w:jc w:val="both"/>
+      </w:pPr>
+      <w:r>
+        <w:rPr>
+          <w:rFonts w:ascii="Times New Roman" w:hAnsi="Times New Roman"/>
+          <w:b w:val="0"/>
+          <w:i w:val="0"/>
+          <w:sz w:val="20"/>
+        </w:rPr>
+        <w:t>[1] H. Tanaka, K. D. Monahan, and D. R. Seals, "Age-predicted maximal heart rate revisited," Journal of the American College of Cardiology, vol. 37, no. 1, pp. 153–156, Jan. 2001. https://doi.org/10.1016/S0735-1097(00)01054-8</w:t>
+      </w:r>
+    </w:p>
+    <w:p>
+      <w:pPr>
+        <w:spacing w:after="80" w:line="360" w:lineRule="auto"/>
+        <w:jc w:val="both"/>
+      </w:pPr>
+      <w:r>
+        <w:rPr>
+          <w:rFonts w:ascii="Times New Roman" w:hAnsi="Times New Roman"/>
+          <w:b w:val="0"/>
+          <w:i w:val="0"/>
+          <w:sz w:val="20"/>
+        </w:rPr>
+        <w:t>[2] M. Gulati, D. K. Pandey, M. F. Arnsdorf, et al., "Heart rate response to exercise stress testing in asymptomatic women: The St. James Women Take Heart Project," Circulation, vol. 122, no. 2, pp. 130–137, Jul. 2010. https://doi.org/10.1161/CIRCULATIONAHA.110.939249</w:t>
+      </w:r>
+    </w:p>
+    <w:p>
+      <w:pPr>
+        <w:spacing w:after="80" w:line="360" w:lineRule="auto"/>
+        <w:jc w:val="both"/>
+      </w:pPr>
+      <w:r>
+        <w:rPr>
+          <w:rFonts w:ascii="Times New Roman" w:hAnsi="Times New Roman"/>
+          <w:b w:val="0"/>
+          <w:i w:val="0"/>
+          <w:sz w:val="20"/>
+        </w:rPr>
+        <w:t>[3] M. J. Karvonen, K. Kentala, and O. Mustala, "The effects of training on heart rate: A longitudinal study," Annales Medicinae Experimentalis et Biologiae Fenniae, vol. 35, no. 3, pp. 307–315, 1957. https://doi.org/10.2165/00007256-198805050-00002</w:t>
+      </w:r>
+    </w:p>
+    <w:p>
+      <w:pPr>
+        <w:spacing w:after="80" w:line="360" w:lineRule="auto"/>
+        <w:jc w:val="both"/>
+      </w:pPr>
+      <w:r>
+        <w:rPr>
+          <w:rFonts w:ascii="Times New Roman" w:hAnsi="Times New Roman"/>
+          <w:b w:val="0"/>
+          <w:i w:val="0"/>
+          <w:sz w:val="20"/>
+        </w:rPr>
+        <w:t>[4] A. Al-Rubaie and J. M. Chang, "Privacy-preserving machine learning: Threats and solutions," IEEE Security &amp; Privacy, vol. 17, no. 2, pp. 49–58, 2019. https://doi.org/10.1109/MSEC.2018.2888775</w:t>
+      </w:r>
+    </w:p>
+    <w:p>
+      <w:pPr>
+        <w:spacing w:after="80" w:line="360" w:lineRule="auto"/>
+        <w:jc w:val="both"/>
+      </w:pPr>
+      <w:r>
+        <w:rPr>
+          <w:rFonts w:ascii="Times New Roman" w:hAnsi="Times New Roman"/>
+          <w:b w:val="0"/>
+          <w:i w:val="0"/>
+          <w:sz w:val="20"/>
+        </w:rPr>
+        <w:t>[5] U. Ekelund, J. Tarp, J. Steene-Johannessen, et al., "Dose-response associations between accelerometer assessed physical activity and all-cause mortality: systematic review and harmonised meta-analysis," The BMJ, vol. 366, p. l4570, 2019. https://doi.org/10.1136/bmj.l4570</w:t>
+      </w:r>
+    </w:p>
+    <w:p>
+      <w:pPr>
+        <w:spacing w:after="80" w:line="360" w:lineRule="auto"/>
+        <w:jc w:val="both"/>
+      </w:pPr>
+      <w:r>
+        <w:rPr>
+          <w:rFonts w:ascii="Times New Roman" w:hAnsi="Times New Roman"/>
+          <w:b w:val="0"/>
+          <w:i w:val="0"/>
+          <w:sz w:val="20"/>
+        </w:rPr>
+        <w:t>[6] P. F. Saint-Maurice, R. P. Troiano, D. R. Bassett, et al., "Association of Daily Step Count and Step Intensity With Mortality Among US Adults," JAMA, vol. 323, no. 12, pp. 1151–1160, 2020. https://doi.org/10.1001/jama.2020.1382</w:t>
+      </w:r>
+    </w:p>
+    <w:p>
+      <w:pPr>
+        <w:spacing w:after="80" w:line="360" w:lineRule="auto"/>
+        <w:jc w:val="both"/>
+      </w:pPr>
+      <w:r>
+        <w:rPr>
+          <w:rFonts w:ascii="Times New Roman" w:hAnsi="Times New Roman"/>
+          <w:b w:val="0"/>
+          <w:i w:val="0"/>
+          <w:sz w:val="20"/>
+        </w:rPr>
+        <w:t>[7] D. Spathis, I. Perez-Pozuelo, L. Brage, N. J. Wareham, and C. Mascolo, "Self-Supervised Transfer Learning on Wearable Sensor Data for Edge Health Analytics," IEEE Journal of Biomedical and Health Informatics, vol. 25, no. 8, pp. 3120–3130, Aug. 2021. https://doi.org/10.1109/JBHI.2021.3069942</w:t>
+      </w:r>
+    </w:p>
+    <w:p>
+      <w:pPr>
+        <w:spacing w:after="80" w:line="360" w:lineRule="auto"/>
+        <w:jc w:val="both"/>
+      </w:pPr>
+      <w:r>
+        <w:rPr>
+          <w:rFonts w:ascii="Times New Roman" w:hAnsi="Times New Roman"/>
+          <w:b w:val="0"/>
+          <w:i w:val="0"/>
+          <w:sz w:val="20"/>
+        </w:rPr>
+        <w:t>[8] F. Al-Turjman, "Edge Computing in Wearable Healthcare Internet of Things: Security, Privacy, and Energy Efficiency," IEEE Internet of Things Journal, vol. 7, no. 9, pp. 8112–8121, Sep. 2020. https://doi.org/10.1109/JIOT.2020.2987504</w:t>
+      </w:r>
+    </w:p>
+    <w:p>
+      <w:pPr>
+        <w:spacing w:after="80" w:line="360" w:lineRule="auto"/>
+        <w:jc w:val="both"/>
+      </w:pPr>
+      <w:r>
+        <w:rPr>
+          <w:rFonts w:ascii="Times New Roman" w:hAnsi="Times New Roman"/>
+          <w:b w:val="0"/>
+          <w:i w:val="0"/>
+          <w:sz w:val="20"/>
+        </w:rPr>
+        <w:t>[9] U.S. Food and Drug Administration, "General Wellness: Policy for Low Risk Devices - Guidance for Industry and Food and Drug Administration Staff," CDRH / FDA, Rockville, MD, 2019.</w:t>
+      </w:r>
+    </w:p>
+    <w:p>
+      <w:pPr>
+        <w:spacing w:after="80" w:line="360" w:lineRule="auto"/>
+        <w:jc w:val="both"/>
+      </w:pPr>
+      <w:r>
+        <w:rPr>
+          <w:rFonts w:ascii="Times New Roman" w:hAnsi="Times New Roman"/>
+          <w:b w:val="0"/>
+          <w:i w:val="0"/>
+          <w:sz w:val="20"/>
+        </w:rPr>
+        <w:t>[10] Central Drugs Standard Control Organisation, "Guidance Document on Software as a Medical Device (SaMD)," Directorate General of Health Services, Ministry of Health and Family Welfare, New Delhi, India, 2023.</w:t>
+      </w:r>
+    </w:p>
+    <w:p>
+      <w:pPr>
+        <w:spacing w:after="80" w:line="360" w:lineRule="auto"/>
+        <w:jc w:val="both"/>
+      </w:pPr>
+      <w:r>
+        <w:rPr>
+          <w:rFonts w:ascii="Times New Roman" w:hAnsi="Times New Roman"/>
+          <w:b w:val="0"/>
+          <w:i w:val="0"/>
+          <w:sz w:val="22"/>
+        </w:rPr>
+        <w:t>[1] Y. Gao, V. K. Soundararajan, and P. X. Liu, "Deep Learning for Mobile Health: A Survey of Architectures and Applications," IEEE Access, vol. 9, pp. 124502–124518, 2021.</w:t>
+      </w:r>
+    </w:p>
+    <w:p>
+      <w:pPr>
+        <w:spacing w:after="80" w:line="360" w:lineRule="auto"/>
+        <w:jc w:val="both"/>
+      </w:pPr>
+      <w:r>
+        <w:rPr>
+          <w:rFonts w:ascii="Times New Roman" w:hAnsi="Times New Roman"/>
+          <w:b w:val="0"/>
+          <w:i w:val="0"/>
+          <w:sz w:val="22"/>
+        </w:rPr>
+        <w:t>[2] D. Spathis, I. Perez-Pozuelo, L. Brage, N. J. Wareham, and C. Mascolo, "Self-Supervised Transfer Learning on Wearable Sensor Data for Edge Health Analytics," IEEE Journal of Biomedical and Health Informatics, vol. 25, no. 8, pp. 3120–3130, Aug. 2021.</w:t>
+      </w:r>
+    </w:p>
+    <w:p>
+      <w:pPr>
+        <w:spacing w:after="80" w:line="360" w:lineRule="auto"/>
+        <w:jc w:val="both"/>
+      </w:pPr>
+      <w:r>
+        <w:rPr>
+          <w:rFonts w:ascii="Times New Roman" w:hAnsi="Times New Roman"/>
+          <w:b w:val="0"/>
+          <w:i w:val="0"/>
+          <w:sz w:val="22"/>
+        </w:rPr>
+        <w:t>[3] Centers for Disease Control and Prevention and World Health Organization, "Global Recommendations on Physical Activity and Sleep for Health," WHO Guidelines Approved by the Guidelines Review Committee, Geneva, Switzerland, 2020.</w:t>
+      </w:r>
+    </w:p>
+    <w:p>
+      <w:pPr>
+        <w:spacing w:after="80" w:line="360" w:lineRule="auto"/>
+        <w:jc w:val="both"/>
+      </w:pPr>
+      <w:r>
+        <w:rPr>
+          <w:rFonts w:ascii="Times New Roman" w:hAnsi="Times New Roman"/>
+          <w:b w:val="0"/>
+          <w:i w:val="0"/>
+          <w:sz w:val="22"/>
+        </w:rPr>
+        <w:t>[4] H. Tanaka, K. D. Monahan, and D. R. Seals, "Age-predicted maximal heart rate revisited," Journal of the American College of Cardiology, vol. 37, no. 1, pp. 153–156, Jan. 2001.</w:t>
+      </w:r>
+    </w:p>
+    <w:p>
+      <w:pPr>
+        <w:spacing w:after="80" w:line="360" w:lineRule="auto"/>
+        <w:jc w:val="both"/>
+      </w:pPr>
+      <w:r>
+        <w:rPr>
+          <w:rFonts w:ascii="Times New Roman" w:hAnsi="Times New Roman"/>
+          <w:b w:val="0"/>
+          <w:i w:val="0"/>
+          <w:sz w:val="22"/>
+        </w:rPr>
+        <w:t>[5] M. Gulati, D. K. Pandey, M. F. Arnsdorf, et al., "Heart rate response to exercise stress testing in asymptomatic women: The St. James Women Take Heart Project," Circulation, vol. 122, no. 2, pp. 130–137, Jul. 2010.</w:t>
+      </w:r>
+    </w:p>
+    <w:p>
+      <w:pPr>
+        <w:spacing w:after="80" w:line="360" w:lineRule="auto"/>
+        <w:jc w:val="both"/>
+      </w:pPr>
+      <w:r>
+        <w:rPr>
+          <w:rFonts w:ascii="Times New Roman" w:hAnsi="Times New Roman"/>
+          <w:b w:val="0"/>
+          <w:i w:val="0"/>
+          <w:sz w:val="22"/>
+        </w:rPr>
+        <w:t>[6] M. J. Karvonen, K. Kentala, and O. Mustala, "The effects of training on heart rate: A longitudinal study," Annales Medicinae Experimentalis et Biologiae Fenniae, vol. 35, no. 3, pp. 307–315, 1957.</w:t>
+      </w:r>
+    </w:p>
+    <w:p>
+      <w:pPr>
+        <w:spacing w:after="80" w:line="360" w:lineRule="auto"/>
+        <w:jc w:val="both"/>
+      </w:pPr>
+      <w:r>
+        <w:rPr>
+          <w:rFonts w:ascii="Times New Roman" w:hAnsi="Times New Roman"/>
+          <w:b w:val="0"/>
+          <w:i w:val="0"/>
+          <w:sz w:val="22"/>
+        </w:rPr>
+        <w:t>[7] Apple Inc., "watchOS Human Interface Guidelines: Designing for Complications and Glanceable Interfaces," Apple Developer Documentation, Cupertino, CA, 2023.</w:t>
+      </w:r>
+    </w:p>
+    <w:p>
+      <w:pPr>
+        <w:spacing w:after="80" w:line="360" w:lineRule="auto"/>
+        <w:jc w:val="both"/>
+      </w:pPr>
+      <w:r>
+        <w:rPr>
+          <w:rFonts w:ascii="Times New Roman" w:hAnsi="Times New Roman"/>
+          <w:b w:val="0"/>
+          <w:i w:val="0"/>
+          <w:sz w:val="22"/>
+        </w:rPr>
+        <w:t>[8] Google LLC, "Wear OS by Google: Architecture and Sensor Ingestion Best Practices," Android Open Source Project, Mountain View, CA, 2023.</w:t>
+      </w:r>
+    </w:p>
+    <w:p>
+      <w:pPr>
+        <w:spacing w:after="80" w:line="360" w:lineRule="auto"/>
+        <w:jc w:val="both"/>
+      </w:pPr>
+      <w:r>
+        <w:rPr>
+          <w:rFonts w:ascii="Times New Roman" w:hAnsi="Times New Roman"/>
+          <w:b w:val="0"/>
+          <w:i w:val="0"/>
+          <w:sz w:val="22"/>
+        </w:rPr>
+        <w:t>[9] S. Zuboff, The Age of Surveillance Capitalism: The Fight for a Human Future at the New Frontier of Power, PublicAffairs, New York, 2019.</w:t>
+      </w:r>
+    </w:p>
+    <w:p>
+      <w:pPr>
+        <w:spacing w:after="80" w:line="360" w:lineRule="auto"/>
+        <w:jc w:val="both"/>
+      </w:pPr>
+      <w:r>
+        <w:rPr>
+          <w:rFonts w:ascii="Times New Roman" w:hAnsi="Times New Roman"/>
+          <w:b w:val="0"/>
+          <w:i w:val="0"/>
+          <w:sz w:val="22"/>
+        </w:rPr>
+        <w:t>[10] F. Al-Turjman, "Edge Computing in Wearable Healthcare Internet of Things: Security, Privacy, and Energy Efficiency," IEEE Internet of Things Journal, vol. 7, no. 9, pp. 8112–8121, Sep. 2020.</w:t>
       </w:r>
     </w:p>
     <w:p>

</xml_diff>